<commit_message>
correction sur une couleur en hex
</commit_message>
<xml_diff>
--- a/Epreuve E6/Docs AP2/charte_graphique.docx
+++ b/Epreuve E6/Docs AP2/charte_graphique.docx
@@ -1,6 +1,6 @@
 
 <file path=word/document.xml><?xml version="1.0" encoding="utf-8"?>
-<w:document xmlns:wpc="http://schemas.microsoft.com/office/word/2010/wordprocessingCanvas" xmlns:cx="http://schemas.microsoft.com/office/drawing/2014/chartex" xmlns:cx1="http://schemas.microsoft.com/office/drawing/2015/9/8/chartex" xmlns:cx2="http://schemas.microsoft.com/office/drawing/2015/10/21/chartex" xmlns:cx3="http://schemas.microsoft.com/office/drawing/2016/5/9/chartex" xmlns:cx4="http://schemas.microsoft.com/office/drawing/2016/5/10/chartex" xmlns:cx5="http://schemas.microsoft.com/office/drawing/2016/5/11/chartex" xmlns:cx6="http://schemas.microsoft.com/office/drawing/2016/5/12/chartex" xmlns:cx7="http://schemas.microsoft.com/office/drawing/2016/5/13/chartex" xmlns:cx8="http://schemas.microsoft.com/office/drawing/2016/5/14/chartex" xmlns:mc="http://schemas.openxmlformats.org/markup-compatibility/2006" xmlns:aink="http://schemas.microsoft.com/office/drawing/2016/ink" xmlns:am3d="http://schemas.microsoft.com/office/drawing/2017/model3d" xmlns:o="urn:schemas-microsoft-com:office:office" xmlns:oel="http://schemas.microsoft.com/office/2019/extlst" xmlns:r="http://schemas.openxmlformats.org/officeDocument/2006/relationships" xmlns:m="http://schemas.openxmlformats.org/officeDocument/2006/math" xmlns:v="urn:schemas-microsoft-com:vml" xmlns:wp14="http://schemas.microsoft.com/office/word/2010/wordprocessingDrawing" xmlns:wp="http://schemas.openxmlformats.org/drawingml/2006/wordprocessingDrawing" xmlns:w10="urn:schemas-microsoft-com:office:word" xmlns:w="http://schemas.openxmlformats.org/wordprocessingml/2006/main" xmlns:w14="http://schemas.microsoft.com/office/word/2010/wordml" xmlns:w15="http://schemas.microsoft.com/office/word/2012/wordml" xmlns:w16cex="http://schemas.microsoft.com/office/word/2018/wordml/cex" xmlns:w16cid="http://schemas.microsoft.com/office/word/2016/wordml/cid" xmlns:w16="http://schemas.microsoft.com/office/word/2018/wordml" xmlns:w16du="http://schemas.microsoft.com/office/word/2023/wordml/word16du" xmlns:w16sdtdh="http://schemas.microsoft.com/office/word/2020/wordml/sdtdatahash" xmlns:w16sdtfl="http://schemas.microsoft.com/office/word/2024/wordml/sdtformatlock" xmlns:w16se="http://schemas.microsoft.com/office/word/2015/wordml/symex" xmlns:wpg="http://schemas.microsoft.com/office/word/2010/wordprocessingGroup" xmlns:wpi="http://schemas.microsoft.com/office/word/2010/wordprocessingInk" xmlns:wne="http://schemas.microsoft.com/office/word/2006/wordml" xmlns:wps="http://schemas.microsoft.com/office/word/2010/wordprocessingShape" xmlns:a="http://schemas.openxmlformats.org/drawingml/2006/main" xmlns:pic="http://schemas.openxmlformats.org/drawingml/2006/picture" xmlns:a14="http://schemas.microsoft.com/office/drawing/2010/main" mc:Ignorable="w14 w15 w16se w16cid w16 w16cex w16sdtdh w16sdtfl w16du wp14">
+<w:document xmlns:wpc="http://schemas.microsoft.com/office/word/2010/wordprocessingCanvas" xmlns:cx="http://schemas.microsoft.com/office/drawing/2014/chartex" xmlns:cx1="http://schemas.microsoft.com/office/drawing/2015/9/8/chartex" xmlns:cx2="http://schemas.microsoft.com/office/drawing/2015/10/21/chartex" xmlns:cx3="http://schemas.microsoft.com/office/drawing/2016/5/9/chartex" xmlns:cx4="http://schemas.microsoft.com/office/drawing/2016/5/10/chartex" xmlns:cx5="http://schemas.microsoft.com/office/drawing/2016/5/11/chartex" xmlns:cx6="http://schemas.microsoft.com/office/drawing/2016/5/12/chartex" xmlns:cx7="http://schemas.microsoft.com/office/drawing/2016/5/13/chartex" xmlns:cx8="http://schemas.microsoft.com/office/drawing/2016/5/14/chartex" xmlns:mc="http://schemas.openxmlformats.org/markup-compatibility/2006" xmlns:aink="http://schemas.microsoft.com/office/drawing/2016/ink" xmlns:am3d="http://schemas.microsoft.com/office/drawing/2017/model3d" xmlns:o="urn:schemas-microsoft-com:office:office" xmlns:oel="http://schemas.microsoft.com/office/2019/extlst" xmlns:r="http://schemas.openxmlformats.org/officeDocument/2006/relationships" xmlns:m="http://schemas.openxmlformats.org/officeDocument/2006/math" xmlns:v="urn:schemas-microsoft-com:vml" xmlns:wp14="http://schemas.microsoft.com/office/word/2010/wordprocessingDrawing" xmlns:wp="http://schemas.openxmlformats.org/drawingml/2006/wordprocessingDrawing" xmlns:w10="urn:schemas-microsoft-com:office:word" xmlns:w="http://schemas.openxmlformats.org/wordprocessingml/2006/main" xmlns:w14="http://schemas.microsoft.com/office/word/2010/wordml" xmlns:w15="http://schemas.microsoft.com/office/word/2012/wordml" xmlns:w16cex="http://schemas.microsoft.com/office/word/2018/wordml/cex" xmlns:w16cid="http://schemas.microsoft.com/office/word/2016/wordml/cid" xmlns:w16="http://schemas.microsoft.com/office/word/2018/wordml" xmlns:w16du="http://schemas.microsoft.com/office/word/2023/wordml/word16du" xmlns:w16sdtdh="http://schemas.microsoft.com/office/word/2020/wordml/sdtdatahash" xmlns:w16sdtfl="http://schemas.microsoft.com/office/word/2024/wordml/sdtformatlock" xmlns:w16se="http://schemas.microsoft.com/office/word/2015/wordml/symex" xmlns:wpg="http://schemas.microsoft.com/office/word/2010/wordprocessingGroup" xmlns:wpi="http://schemas.microsoft.com/office/word/2010/wordprocessingInk" xmlns:wne="http://schemas.microsoft.com/office/word/2006/wordml" xmlns:wps="http://schemas.microsoft.com/office/word/2010/wordprocessingShape" mc:Ignorable="w14 w15 w16se w16cid w16 w16cex w16sdtdh w16sdtfl w16du wp14">
   <w:body>
     <w:p>
       <w:pPr>
@@ -79,6 +79,7 @@
       </w:pPr>
       <w:r>
         <w:rPr>
+          <w:noProof/>
           <w:color w:val="EE0000"/>
         </w:rPr>
         <w:drawing>
@@ -97,7 +98,7 @@
                     <pic:cNvPicPr/>
                   </pic:nvPicPr>
                   <pic:blipFill>
-                    <a:blip r:embed="rId4"/>
+                    <a:blip r:embed="rId7"/>
                     <a:stretch>
                       <a:fillRect/>
                     </a:stretch>
@@ -157,13 +158,6 @@
           <w:color w:val="0070C0"/>
         </w:rPr>
         <w:tab/>
-      </w:r>
-      <w:r>
-        <w:rPr>
-          <w:b/>
-          <w:bCs/>
-          <w:color w:val="0070C0"/>
-        </w:rPr>
         <w:t>#243E36</w:t>
       </w:r>
       <w:r>
@@ -197,14 +191,7 @@
           <w:color w:val="0070C0"/>
         </w:rPr>
         <w:tab/>
-      </w:r>
-      <w:r>
-        <w:rPr>
-          <w:b/>
-          <w:bCs/>
-          <w:color w:val="0070C0"/>
-        </w:rPr>
-        <w:t>#7CCA982</w:t>
+        <w:t>#7CA982</w:t>
       </w:r>
     </w:p>
     <w:p>
@@ -298,18 +285,8 @@
           <w:sz w:val="28"/>
           <w:szCs w:val="28"/>
         </w:rPr>
-        <w:t xml:space="preserve"> – 700 </w:t>
-      </w:r>
-      <w:proofErr w:type="spellStart"/>
-      <w:r>
-        <w:rPr>
-          <w:color w:val="0070C0"/>
-          <w:sz w:val="28"/>
-          <w:szCs w:val="28"/>
-        </w:rPr>
-        <w:t>wheight</w:t>
-      </w:r>
-      <w:proofErr w:type="spellEnd"/>
+        <w:t xml:space="preserve"> – 700 wheight</w:t>
+      </w:r>
       <w:r>
         <w:rPr>
           <w:color w:val="EE0000"/>
@@ -382,35 +359,7 @@
         <w:rPr>
           <w:color w:val="0070C0"/>
         </w:rPr>
-        <w:t>&lt;</w:t>
-      </w:r>
-      <w:proofErr w:type="spellStart"/>
-      <w:r>
-        <w:rPr>
-          <w:color w:val="0070C0"/>
-        </w:rPr>
-        <w:t>link</w:t>
-      </w:r>
-      <w:proofErr w:type="spellEnd"/>
-      <w:r>
-        <w:rPr>
-          <w:color w:val="0070C0"/>
-        </w:rPr>
-        <w:t xml:space="preserve"> rel="</w:t>
-      </w:r>
-      <w:proofErr w:type="spellStart"/>
-      <w:r>
-        <w:rPr>
-          <w:color w:val="0070C0"/>
-        </w:rPr>
-        <w:t>preconnect</w:t>
-      </w:r>
-      <w:proofErr w:type="spellEnd"/>
-      <w:r>
-        <w:rPr>
-          <w:color w:val="0070C0"/>
-        </w:rPr>
-        <w:t>" href="https://fonts.googleapis.com"&gt;</w:t>
+        <w:t>&lt;link rel="preconnect" href="https://fonts.googleapis.com"&gt;</w:t>
       </w:r>
     </w:p>
     <w:p>
@@ -423,51 +372,7 @@
         <w:rPr>
           <w:color w:val="0070C0"/>
         </w:rPr>
-        <w:t>&lt;</w:t>
-      </w:r>
-      <w:proofErr w:type="spellStart"/>
-      <w:proofErr w:type="gramStart"/>
-      <w:r>
-        <w:rPr>
-          <w:color w:val="0070C0"/>
-        </w:rPr>
-        <w:t>link</w:t>
-      </w:r>
-      <w:proofErr w:type="spellEnd"/>
-      <w:proofErr w:type="gramEnd"/>
-      <w:r>
-        <w:rPr>
-          <w:color w:val="0070C0"/>
-        </w:rPr>
-        <w:t xml:space="preserve"> rel="</w:t>
-      </w:r>
-      <w:proofErr w:type="spellStart"/>
-      <w:r>
-        <w:rPr>
-          <w:color w:val="0070C0"/>
-        </w:rPr>
-        <w:t>preconnect</w:t>
-      </w:r>
-      <w:proofErr w:type="spellEnd"/>
-      <w:r>
-        <w:rPr>
-          <w:color w:val="0070C0"/>
-        </w:rPr>
-        <w:t xml:space="preserve">" href="https://fonts.gstatic.com" </w:t>
-      </w:r>
-      <w:proofErr w:type="spellStart"/>
-      <w:r>
-        <w:rPr>
-          <w:color w:val="0070C0"/>
-        </w:rPr>
-        <w:t>crossorigin</w:t>
-      </w:r>
-      <w:proofErr w:type="spellEnd"/>
-      <w:r>
-        <w:rPr>
-          <w:color w:val="0070C0"/>
-        </w:rPr>
-        <w:t>&gt;</w:t>
+        <w:t>&lt;link rel="preconnect" href="https://fonts.gstatic.com" crossorigin&gt;</w:t>
       </w:r>
     </w:p>
     <w:p>
@@ -480,18 +385,8 @@
         <w:rPr>
           <w:color w:val="0070C0"/>
         </w:rPr>
-        <w:t>&lt;</w:t>
-      </w:r>
-      <w:proofErr w:type="spellStart"/>
-      <w:proofErr w:type="gramStart"/>
-      <w:r>
-        <w:rPr>
-          <w:color w:val="0070C0"/>
-        </w:rPr>
-        <w:t>link</w:t>
-      </w:r>
-      <w:proofErr w:type="spellEnd"/>
-      <w:proofErr w:type="gramEnd"/>
+        <w:t>&lt;link</w:t>
+      </w:r>
       <w:r>
         <w:rPr>
           <w:color w:val="0070C0"/>
@@ -502,21 +397,7 @@
         <w:rPr>
           <w:color w:val="0070C0"/>
         </w:rPr>
-        <w:t>href="https://fonts.googleapis.com/css2?family=League+Spartan:wght@700&amp;display=swap" rel="</w:t>
-      </w:r>
-      <w:proofErr w:type="spellStart"/>
-      <w:r>
-        <w:rPr>
-          <w:color w:val="0070C0"/>
-        </w:rPr>
-        <w:t>stylesheet</w:t>
-      </w:r>
-      <w:proofErr w:type="spellEnd"/>
-      <w:r>
-        <w:rPr>
-          <w:color w:val="0070C0"/>
-        </w:rPr>
-        <w:t>"&gt;</w:t>
+        <w:t>href="https://fonts.googleapis.com/css2?family=League+Spartan:wght@700&amp;display=swap" rel="stylesheet"&gt;</w:t>
       </w:r>
     </w:p>
     <w:p>
@@ -546,7 +427,6 @@
         </w:rPr>
         <w:t xml:space="preserve"> </w:t>
       </w:r>
-      <w:proofErr w:type="spellStart"/>
       <w:r>
         <w:rPr>
           <w:b/>
@@ -557,7 +437,6 @@
         </w:rPr>
         <w:t>Roboto</w:t>
       </w:r>
-      <w:proofErr w:type="spellEnd"/>
     </w:p>
     <w:p>
       <w:pPr>
@@ -608,37 +487,7 @@
         <w:rPr>
           <w:color w:val="0070C0"/>
         </w:rPr>
-        <w:t>&lt;</w:t>
-      </w:r>
-      <w:proofErr w:type="spellStart"/>
-      <w:proofErr w:type="gramStart"/>
-      <w:r>
-        <w:rPr>
-          <w:color w:val="0070C0"/>
-        </w:rPr>
-        <w:t>link</w:t>
-      </w:r>
-      <w:proofErr w:type="spellEnd"/>
-      <w:proofErr w:type="gramEnd"/>
-      <w:r>
-        <w:rPr>
-          <w:color w:val="0070C0"/>
-        </w:rPr>
-        <w:t xml:space="preserve"> rel="</w:t>
-      </w:r>
-      <w:proofErr w:type="spellStart"/>
-      <w:r>
-        <w:rPr>
-          <w:color w:val="0070C0"/>
-        </w:rPr>
-        <w:t>preconnect</w:t>
-      </w:r>
-      <w:proofErr w:type="spellEnd"/>
-      <w:r>
-        <w:rPr>
-          <w:color w:val="0070C0"/>
-        </w:rPr>
-        <w:t>" href="https://fonts.googleapis.com"&gt;</w:t>
+        <w:t>&lt;link rel="preconnect" href="https://fonts.googleapis.com"&gt;</w:t>
       </w:r>
     </w:p>
     <w:p>
@@ -651,51 +500,7 @@
         <w:rPr>
           <w:color w:val="0070C0"/>
         </w:rPr>
-        <w:t>&lt;</w:t>
-      </w:r>
-      <w:proofErr w:type="spellStart"/>
-      <w:proofErr w:type="gramStart"/>
-      <w:r>
-        <w:rPr>
-          <w:color w:val="0070C0"/>
-        </w:rPr>
-        <w:t>link</w:t>
-      </w:r>
-      <w:proofErr w:type="spellEnd"/>
-      <w:proofErr w:type="gramEnd"/>
-      <w:r>
-        <w:rPr>
-          <w:color w:val="0070C0"/>
-        </w:rPr>
-        <w:t xml:space="preserve"> rel="</w:t>
-      </w:r>
-      <w:proofErr w:type="spellStart"/>
-      <w:r>
-        <w:rPr>
-          <w:color w:val="0070C0"/>
-        </w:rPr>
-        <w:t>preconnect</w:t>
-      </w:r>
-      <w:proofErr w:type="spellEnd"/>
-      <w:r>
-        <w:rPr>
-          <w:color w:val="0070C0"/>
-        </w:rPr>
-        <w:t xml:space="preserve">" href="https://fonts.gstatic.com" </w:t>
-      </w:r>
-      <w:proofErr w:type="spellStart"/>
-      <w:r>
-        <w:rPr>
-          <w:color w:val="0070C0"/>
-        </w:rPr>
-        <w:t>crossorigin</w:t>
-      </w:r>
-      <w:proofErr w:type="spellEnd"/>
-      <w:r>
-        <w:rPr>
-          <w:color w:val="0070C0"/>
-        </w:rPr>
-        <w:t>&gt;</w:t>
+        <w:t>&lt;link rel="preconnect" href="https://fonts.gstatic.com" crossorigin&gt;</w:t>
       </w:r>
     </w:p>
     <w:p>
@@ -708,56 +513,22 @@
         <w:rPr>
           <w:color w:val="0070C0"/>
         </w:rPr>
-        <w:t>&lt;</w:t>
-      </w:r>
-      <w:proofErr w:type="spellStart"/>
-      <w:proofErr w:type="gramStart"/>
-      <w:r>
-        <w:rPr>
-          <w:color w:val="0070C0"/>
-        </w:rPr>
-        <w:t>link</w:t>
-      </w:r>
-      <w:proofErr w:type="spellEnd"/>
-      <w:proofErr w:type="gramEnd"/>
-      <w:r>
-        <w:rPr>
-          <w:color w:val="0070C0"/>
-        </w:rPr>
-        <w:t xml:space="preserve"> href="https://fonts.googleapis.com/css2?family=League+Spartan:wght@100..900&amp;family=Roboto:ital,wght@0,100..900;1,100..900&amp;display=swap" rel="</w:t>
-      </w:r>
-      <w:proofErr w:type="spellStart"/>
-      <w:r>
-        <w:rPr>
-          <w:color w:val="0070C0"/>
-        </w:rPr>
-        <w:t>stylesheet</w:t>
-      </w:r>
-      <w:proofErr w:type="spellEnd"/>
-      <w:r>
-        <w:rPr>
-          <w:color w:val="0070C0"/>
-        </w:rPr>
-        <w:t>"&gt;</w:t>
-      </w:r>
-    </w:p>
-    <w:p w14:noSpellErr="1">
-      <w:pPr>
-        <w:rPr>
-          <w:color w:val="0070C0"/>
-        </w:rPr>
-      </w:pPr>
+        <w:t>&lt;link href="https://fonts.googleapis.com/css2?family=League+Spartan:wght@100..900&amp;family=Roboto:ital,wght@0,100..900;1,100..900&amp;display=swap" rel="stylesheet"&gt;</w:t>
+      </w:r>
     </w:p>
     <w:p>
       <w:pPr>
-        <w:pStyle w:val="Normal"/>
+        <w:rPr>
+          <w:color w:val="0070C0"/>
+        </w:rPr>
       </w:pPr>
     </w:p>
+    <w:p/>
     <w:p>
       <w:pPr>
         <w:rPr>
-          <w:b w:val="1"/>
-          <w:bCs w:val="1"/>
+          <w:b/>
+          <w:bCs/>
           <w:color w:val="EE0000"/>
           <w:sz w:val="28"/>
           <w:szCs w:val="28"/>
@@ -765,29 +536,33 @@
       </w:pPr>
       <w:r>
         <w:rPr>
-          <w:b w:val="1"/>
-          <w:bCs w:val="1"/>
+          <w:b/>
+          <w:bCs/>
           <w:color w:val="EE0000"/>
           <w:sz w:val="28"/>
           <w:szCs w:val="28"/>
           <w:u w:val="single"/>
         </w:rPr>
+        <w:lastRenderedPageBreak/>
         <w:t>Idées Logo :</w:t>
       </w:r>
       <w:r>
         <w:br/>
       </w:r>
       <w:r>
+        <w:rPr>
+          <w:noProof/>
+        </w:rPr>
         <w:drawing>
-          <wp:inline wp14:editId="21E00D4D" wp14:anchorId="19FE2371">
+          <wp:inline distT="0" distB="0" distL="0" distR="0" wp14:anchorId="19FE2371" wp14:editId="21E00D4D">
             <wp:extent cx="2695575" cy="2695575"/>
             <wp:effectExtent l="0" t="0" r="0" b="0"/>
             <wp:docPr id="119775867" name="Image 1"/>
             <wp:cNvGraphicFramePr>
-              <a:graphicFrameLocks noChangeAspect="1"/>
+              <a:graphicFrameLocks xmlns:a="http://schemas.openxmlformats.org/drawingml/2006/main" noChangeAspect="1"/>
             </wp:cNvGraphicFramePr>
-            <a:graphic>
-              <a:graphicData xmlns:a="http://schemas.openxmlformats.org/drawingml/2006/main" uri="http://schemas.openxmlformats.org/drawingml/2006/picture">
+            <a:graphic xmlns:a="http://schemas.openxmlformats.org/drawingml/2006/main">
+              <a:graphicData uri="http://schemas.openxmlformats.org/drawingml/2006/picture">
                 <pic:pic xmlns:pic="http://schemas.openxmlformats.org/drawingml/2006/picture">
                   <pic:nvPicPr>
                     <pic:cNvPr id="0" name="Picture 1"/>
@@ -796,7 +571,7 @@
                     </pic:cNvPicPr>
                   </pic:nvPicPr>
                   <pic:blipFill>
-                    <a:blip xmlns:r="http://schemas.openxmlformats.org/officeDocument/2006/relationships" r:embed="rId5">
+                    <a:blip r:embed="rId8">
                       <a:extLst>
                         <a:ext uri="{28A0092B-C50C-407E-A947-70E740481C1C}">
                           <a14:useLocalDpi xmlns:a14="http://schemas.microsoft.com/office/drawing/2010/main"/>
@@ -809,7 +584,7 @@
                     </a:stretch>
                   </pic:blipFill>
                   <pic:spPr bwMode="auto">
-                    <a:xfrm rot="0">
+                    <a:xfrm>
                       <a:off x="0" y="0"/>
                       <a:ext cx="2695575" cy="2695575"/>
                     </a:xfrm>
@@ -829,27 +604,27 @@
       </w:r>
     </w:p>
     <w:p>
-      <w:pPr>
-        <w:pStyle w:val="Normal"/>
-      </w:pPr>
-      <w:r>
+      <w:r>
+        <w:rPr>
+          <w:noProof/>
+        </w:rPr>
         <w:drawing>
-          <wp:inline wp14:editId="2BC7CF6E" wp14:anchorId="0B6C7BD4">
+          <wp:inline distT="0" distB="0" distL="0" distR="0" wp14:anchorId="0B6C7BD4" wp14:editId="2BC7CF6E">
             <wp:extent cx="1428950" cy="1627760"/>
             <wp:effectExtent l="0" t="0" r="0" b="0"/>
             <wp:docPr id="42516011" name="drawing"/>
             <wp:cNvGraphicFramePr>
-              <a:graphicFrameLocks noChangeAspect="1"/>
+              <a:graphicFrameLocks xmlns:a="http://schemas.openxmlformats.org/drawingml/2006/main" noChangeAspect="1"/>
             </wp:cNvGraphicFramePr>
-            <a:graphic>
-              <a:graphicData xmlns:a="http://schemas.openxmlformats.org/drawingml/2006/main" uri="http://schemas.openxmlformats.org/drawingml/2006/picture">
+            <a:graphic xmlns:a="http://schemas.openxmlformats.org/drawingml/2006/main">
+              <a:graphicData uri="http://schemas.openxmlformats.org/drawingml/2006/picture">
                 <pic:pic xmlns:pic="http://schemas.openxmlformats.org/drawingml/2006/picture">
                   <pic:nvPicPr>
                     <pic:cNvPr id="42516011" name=""/>
                     <pic:cNvPicPr/>
                   </pic:nvPicPr>
                   <pic:blipFill>
-                    <a:blip xmlns:r="http://schemas.openxmlformats.org/officeDocument/2006/relationships" r:embed="rId2070045092">
+                    <a:blip r:embed="rId9">
                       <a:extLst>
                         <a:ext uri="{28A0092B-C50C-407E-A947-70E740481C1C}">
                           <a14:useLocalDpi xmlns:a14="http://schemas.microsoft.com/office/drawing/2010/main"/>
@@ -861,7 +636,7 @@
                     </a:stretch>
                   </pic:blipFill>
                   <pic:spPr>
-                    <a:xfrm rot="0">
+                    <a:xfrm>
                       <a:off x="0" y="0"/>
                       <a:ext cx="1428950" cy="1627760"/>
                     </a:xfrm>
@@ -876,28 +651,12 @@
         </w:drawing>
       </w:r>
     </w:p>
-    <w:p>
-      <w:pPr>
-        <w:pStyle w:val="Normal"/>
-      </w:pPr>
-    </w:p>
-    <w:p>
-      <w:pPr>
-        <w:pStyle w:val="Normal"/>
-      </w:pPr>
-    </w:p>
-    <w:p>
-      <w:pPr>
-        <w:pStyle w:val="Normal"/>
-      </w:pPr>
-    </w:p>
-    <w:p>
-      <w:pPr>
-        <w:pStyle w:val="Normal"/>
-      </w:pPr>
-    </w:p>
+    <w:p/>
+    <w:p/>
+    <w:p/>
+    <w:p/>
     <w:sectPr>
-      <w:pgSz w:w="11906" w:h="16838" w:orient="portrait"/>
+      <w:pgSz w:w="11906" w:h="16838"/>
       <w:pgMar w:top="1417" w:right="1417" w:bottom="1417" w:left="1417" w:header="708" w:footer="708" w:gutter="0"/>
       <w:cols w:space="708"/>
       <w:docGrid w:linePitch="360"/>
@@ -907,11 +666,11 @@
 </file>
 
 <file path=word/styles.xml><?xml version="1.0" encoding="utf-8"?>
-<w:styles xmlns:wp14="http://schemas.microsoft.com/office/word/2010/wordprocessingDrawing" xmlns:mc="http://schemas.openxmlformats.org/markup-compatibility/2006" xmlns:r="http://schemas.openxmlformats.org/officeDocument/2006/relationships" xmlns:w="http://schemas.openxmlformats.org/wordprocessingml/2006/main" xmlns:w14="http://schemas.microsoft.com/office/word/2010/wordml" xmlns:w15="http://schemas.microsoft.com/office/word/2012/wordml" xmlns:w16cex="http://schemas.microsoft.com/office/word/2018/wordml/cex" xmlns:w16cid="http://schemas.microsoft.com/office/word/2016/wordml/cid" xmlns:w16="http://schemas.microsoft.com/office/word/2018/wordml" xmlns:w16du="http://schemas.microsoft.com/office/word/2023/wordml/word16du" xmlns:w16sdtdh="http://schemas.microsoft.com/office/word/2020/wordml/sdtdatahash" xmlns:w16sdtfl="http://schemas.microsoft.com/office/word/2024/wordml/sdtformatlock" xmlns:w16se="http://schemas.microsoft.com/office/word/2015/wordml/symex" mc:Ignorable="w14 w15 w16se w16cid w16 w16cex w16sdtdh w16sdtfl w16du wp14">
+<w:styles xmlns:mc="http://schemas.openxmlformats.org/markup-compatibility/2006" xmlns:r="http://schemas.openxmlformats.org/officeDocument/2006/relationships" xmlns:w="http://schemas.openxmlformats.org/wordprocessingml/2006/main" xmlns:w14="http://schemas.microsoft.com/office/word/2010/wordml" xmlns:w15="http://schemas.microsoft.com/office/word/2012/wordml" xmlns:w16cex="http://schemas.microsoft.com/office/word/2018/wordml/cex" xmlns:w16cid="http://schemas.microsoft.com/office/word/2016/wordml/cid" xmlns:w16="http://schemas.microsoft.com/office/word/2018/wordml" xmlns:w16du="http://schemas.microsoft.com/office/word/2023/wordml/word16du" xmlns:w16sdtdh="http://schemas.microsoft.com/office/word/2020/wordml/sdtdatahash" xmlns:w16sdtfl="http://schemas.microsoft.com/office/word/2024/wordml/sdtformatlock" xmlns:w16se="http://schemas.microsoft.com/office/word/2015/wordml/symex" mc:Ignorable="w14 w15 w16se w16cid w16 w16cex w16sdtdh w16sdtfl w16du">
   <w:docDefaults>
     <w:rPrDefault>
       <w:rPr>
-        <w:rFonts w:asciiTheme="minorHAnsi" w:hAnsiTheme="minorHAnsi" w:eastAsiaTheme="minorHAnsi" w:cstheme="minorBidi"/>
+        <w:rFonts w:asciiTheme="minorHAnsi" w:eastAsiaTheme="minorHAnsi" w:hAnsiTheme="minorHAnsi" w:cstheme="minorBidi"/>
         <w:kern w:val="2"/>
         <w:sz w:val="24"/>
         <w:szCs w:val="24"/>
@@ -928,14 +687,14 @@
   <w:latentStyles w:defLockedState="0" w:defUIPriority="99" w:defSemiHidden="0" w:defUnhideWhenUsed="0" w:defQFormat="0" w:count="376">
     <w:lsdException w:name="Normal" w:uiPriority="0" w:qFormat="1"/>
     <w:lsdException w:name="heading 1" w:uiPriority="9" w:qFormat="1"/>
-    <w:lsdException w:name="heading 2" w:uiPriority="9" w:semiHidden="1" w:unhideWhenUsed="1" w:qFormat="1"/>
-    <w:lsdException w:name="heading 3" w:uiPriority="9" w:semiHidden="1" w:unhideWhenUsed="1" w:qFormat="1"/>
-    <w:lsdException w:name="heading 4" w:uiPriority="9" w:semiHidden="1" w:unhideWhenUsed="1" w:qFormat="1"/>
-    <w:lsdException w:name="heading 5" w:uiPriority="9" w:semiHidden="1" w:unhideWhenUsed="1" w:qFormat="1"/>
-    <w:lsdException w:name="heading 6" w:uiPriority="9" w:semiHidden="1" w:unhideWhenUsed="1" w:qFormat="1"/>
-    <w:lsdException w:name="heading 7" w:uiPriority="9" w:semiHidden="1" w:unhideWhenUsed="1" w:qFormat="1"/>
-    <w:lsdException w:name="heading 8" w:uiPriority="9" w:semiHidden="1" w:unhideWhenUsed="1" w:qFormat="1"/>
-    <w:lsdException w:name="heading 9" w:uiPriority="9" w:semiHidden="1" w:unhideWhenUsed="1" w:qFormat="1"/>
+    <w:lsdException w:name="heading 2" w:semiHidden="1" w:uiPriority="9" w:unhideWhenUsed="1" w:qFormat="1"/>
+    <w:lsdException w:name="heading 3" w:semiHidden="1" w:uiPriority="9" w:unhideWhenUsed="1" w:qFormat="1"/>
+    <w:lsdException w:name="heading 4" w:semiHidden="1" w:uiPriority="9" w:unhideWhenUsed="1" w:qFormat="1"/>
+    <w:lsdException w:name="heading 5" w:semiHidden="1" w:uiPriority="9" w:unhideWhenUsed="1" w:qFormat="1"/>
+    <w:lsdException w:name="heading 6" w:semiHidden="1" w:uiPriority="9" w:unhideWhenUsed="1" w:qFormat="1"/>
+    <w:lsdException w:name="heading 7" w:semiHidden="1" w:uiPriority="9" w:unhideWhenUsed="1" w:qFormat="1"/>
+    <w:lsdException w:name="heading 8" w:semiHidden="1" w:uiPriority="9" w:unhideWhenUsed="1" w:qFormat="1"/>
+    <w:lsdException w:name="heading 9" w:semiHidden="1" w:uiPriority="9" w:unhideWhenUsed="1" w:qFormat="1"/>
     <w:lsdException w:name="index 1" w:semiHidden="1" w:unhideWhenUsed="1"/>
     <w:lsdException w:name="index 2" w:semiHidden="1" w:unhideWhenUsed="1"/>
     <w:lsdException w:name="index 3" w:semiHidden="1" w:unhideWhenUsed="1"/>
@@ -945,22 +704,22 @@
     <w:lsdException w:name="index 7" w:semiHidden="1" w:unhideWhenUsed="1"/>
     <w:lsdException w:name="index 8" w:semiHidden="1" w:unhideWhenUsed="1"/>
     <w:lsdException w:name="index 9" w:semiHidden="1" w:unhideWhenUsed="1"/>
-    <w:lsdException w:name="toc 1" w:uiPriority="39" w:semiHidden="1" w:unhideWhenUsed="1"/>
-    <w:lsdException w:name="toc 2" w:uiPriority="39" w:semiHidden="1" w:unhideWhenUsed="1"/>
-    <w:lsdException w:name="toc 3" w:uiPriority="39" w:semiHidden="1" w:unhideWhenUsed="1"/>
-    <w:lsdException w:name="toc 4" w:uiPriority="39" w:semiHidden="1" w:unhideWhenUsed="1"/>
-    <w:lsdException w:name="toc 5" w:uiPriority="39" w:semiHidden="1" w:unhideWhenUsed="1"/>
-    <w:lsdException w:name="toc 6" w:uiPriority="39" w:semiHidden="1" w:unhideWhenUsed="1"/>
-    <w:lsdException w:name="toc 7" w:uiPriority="39" w:semiHidden="1" w:unhideWhenUsed="1"/>
-    <w:lsdException w:name="toc 8" w:uiPriority="39" w:semiHidden="1" w:unhideWhenUsed="1"/>
-    <w:lsdException w:name="toc 9" w:uiPriority="39" w:semiHidden="1" w:unhideWhenUsed="1"/>
+    <w:lsdException w:name="toc 1" w:semiHidden="1" w:uiPriority="39" w:unhideWhenUsed="1"/>
+    <w:lsdException w:name="toc 2" w:semiHidden="1" w:uiPriority="39" w:unhideWhenUsed="1"/>
+    <w:lsdException w:name="toc 3" w:semiHidden="1" w:uiPriority="39" w:unhideWhenUsed="1"/>
+    <w:lsdException w:name="toc 4" w:semiHidden="1" w:uiPriority="39" w:unhideWhenUsed="1"/>
+    <w:lsdException w:name="toc 5" w:semiHidden="1" w:uiPriority="39" w:unhideWhenUsed="1"/>
+    <w:lsdException w:name="toc 6" w:semiHidden="1" w:uiPriority="39" w:unhideWhenUsed="1"/>
+    <w:lsdException w:name="toc 7" w:semiHidden="1" w:uiPriority="39" w:unhideWhenUsed="1"/>
+    <w:lsdException w:name="toc 8" w:semiHidden="1" w:uiPriority="39" w:unhideWhenUsed="1"/>
+    <w:lsdException w:name="toc 9" w:semiHidden="1" w:uiPriority="39" w:unhideWhenUsed="1"/>
     <w:lsdException w:name="Normal Indent" w:semiHidden="1" w:unhideWhenUsed="1"/>
     <w:lsdException w:name="footnote text" w:semiHidden="1" w:unhideWhenUsed="1"/>
     <w:lsdException w:name="annotation text" w:semiHidden="1" w:unhideWhenUsed="1"/>
     <w:lsdException w:name="header" w:semiHidden="1" w:unhideWhenUsed="1"/>
     <w:lsdException w:name="footer" w:semiHidden="1" w:unhideWhenUsed="1"/>
     <w:lsdException w:name="index heading" w:semiHidden="1" w:unhideWhenUsed="1"/>
-    <w:lsdException w:name="caption" w:uiPriority="35" w:semiHidden="1" w:unhideWhenUsed="1" w:qFormat="1"/>
+    <w:lsdException w:name="caption" w:semiHidden="1" w:uiPriority="35" w:unhideWhenUsed="1" w:qFormat="1"/>
     <w:lsdException w:name="table of figures" w:semiHidden="1" w:unhideWhenUsed="1"/>
     <w:lsdException w:name="envelope address" w:semiHidden="1" w:unhideWhenUsed="1"/>
     <w:lsdException w:name="envelope return" w:semiHidden="1" w:unhideWhenUsed="1"/>
@@ -991,7 +750,7 @@
     <w:lsdException w:name="Title" w:uiPriority="10" w:qFormat="1"/>
     <w:lsdException w:name="Closing" w:semiHidden="1" w:unhideWhenUsed="1"/>
     <w:lsdException w:name="Signature" w:semiHidden="1" w:unhideWhenUsed="1"/>
-    <w:lsdException w:name="Default Paragraph Font" w:uiPriority="1" w:semiHidden="1" w:unhideWhenUsed="1"/>
+    <w:lsdException w:name="Default Paragraph Font" w:semiHidden="1" w:uiPriority="1" w:unhideWhenUsed="1"/>
     <w:lsdException w:name="Body Text" w:semiHidden="1" w:unhideWhenUsed="1"/>
     <w:lsdException w:name="Body Text Indent" w:semiHidden="1" w:unhideWhenUsed="1"/>
     <w:lsdException w:name="List Continue" w:semiHidden="1" w:unhideWhenUsed="1"/>
@@ -1191,8 +950,8 @@
     <w:lsdException w:name="Subtle Reference" w:uiPriority="31" w:qFormat="1"/>
     <w:lsdException w:name="Intense Reference" w:uiPriority="32" w:qFormat="1"/>
     <w:lsdException w:name="Book Title" w:uiPriority="33" w:qFormat="1"/>
-    <w:lsdException w:name="Bibliography" w:uiPriority="37" w:semiHidden="1" w:unhideWhenUsed="1"/>
-    <w:lsdException w:name="TOC Heading" w:uiPriority="39" w:semiHidden="1" w:unhideWhenUsed="1" w:qFormat="1"/>
+    <w:lsdException w:name="Bibliography" w:semiHidden="1" w:uiPriority="37" w:unhideWhenUsed="1"/>
+    <w:lsdException w:name="TOC Heading" w:semiHidden="1" w:uiPriority="39" w:unhideWhenUsed="1" w:qFormat="1"/>
     <w:lsdException w:name="Plain Table 1" w:uiPriority="41"/>
     <w:lsdException w:name="Plain Table 2" w:uiPriority="42"/>
     <w:lsdException w:name="Plain Table 3" w:uiPriority="43"/>
@@ -1303,7 +1062,7 @@
     <w:lsdException w:name="Unresolved Mention" w:semiHidden="1" w:unhideWhenUsed="1"/>
     <w:lsdException w:name="Smart Link" w:semiHidden="1" w:unhideWhenUsed="1"/>
   </w:latentStyles>
-  <w:style w:type="paragraph" w:styleId="Normal" w:default="1">
+  <w:style w:type="paragraph" w:default="1" w:styleId="Normal">
     <w:name w:val="Normal"/>
     <w:qFormat/>
   </w:style>
@@ -1322,7 +1081,7 @@
       <w:outlineLvl w:val="0"/>
     </w:pPr>
     <w:rPr>
-      <w:rFonts w:asciiTheme="majorHAnsi" w:hAnsiTheme="majorHAnsi" w:eastAsiaTheme="majorEastAsia" w:cstheme="majorBidi"/>
+      <w:rFonts w:asciiTheme="majorHAnsi" w:eastAsiaTheme="majorEastAsia" w:hAnsiTheme="majorHAnsi" w:cstheme="majorBidi"/>
       <w:color w:val="0F4761" w:themeColor="accent1" w:themeShade="BF"/>
       <w:sz w:val="40"/>
       <w:szCs w:val="40"/>
@@ -1345,7 +1104,7 @@
       <w:outlineLvl w:val="1"/>
     </w:pPr>
     <w:rPr>
-      <w:rFonts w:asciiTheme="majorHAnsi" w:hAnsiTheme="majorHAnsi" w:eastAsiaTheme="majorEastAsia" w:cstheme="majorBidi"/>
+      <w:rFonts w:asciiTheme="majorHAnsi" w:eastAsiaTheme="majorEastAsia" w:hAnsiTheme="majorHAnsi" w:cstheme="majorBidi"/>
       <w:color w:val="0F4761" w:themeColor="accent1" w:themeShade="BF"/>
       <w:sz w:val="32"/>
       <w:szCs w:val="32"/>
@@ -1506,12 +1265,13 @@
       <w:color w:val="272727" w:themeColor="text1" w:themeTint="D8"/>
     </w:rPr>
   </w:style>
-  <w:style w:type="character" w:styleId="Policepardfaut" w:default="1">
+  <w:style w:type="character" w:default="1" w:styleId="Policepardfaut">
     <w:name w:val="Default Paragraph Font"/>
     <w:uiPriority w:val="1"/>
+    <w:semiHidden/>
     <w:unhideWhenUsed/>
   </w:style>
-  <w:style w:type="table" w:styleId="TableauNormal" w:default="1">
+  <w:style w:type="table" w:default="1" w:styleId="TableauNormal">
     <w:name w:val="Normal Table"/>
     <w:uiPriority w:val="99"/>
     <w:semiHidden/>
@@ -1526,26 +1286,26 @@
       </w:tblCellMar>
     </w:tblPr>
   </w:style>
-  <w:style w:type="numbering" w:styleId="Aucuneliste" w:default="1">
+  <w:style w:type="numbering" w:default="1" w:styleId="Aucuneliste">
     <w:name w:val="No List"/>
     <w:uiPriority w:val="99"/>
     <w:semiHidden/>
     <w:unhideWhenUsed/>
   </w:style>
-  <w:style w:type="character" w:styleId="Titre1Car" w:customStyle="1">
+  <w:style w:type="character" w:customStyle="1" w:styleId="Titre1Car">
     <w:name w:val="Titre 1 Car"/>
     <w:basedOn w:val="Policepardfaut"/>
     <w:link w:val="Titre1"/>
     <w:uiPriority w:val="9"/>
     <w:rsid w:val="006350F7"/>
     <w:rPr>
-      <w:rFonts w:asciiTheme="majorHAnsi" w:hAnsiTheme="majorHAnsi" w:eastAsiaTheme="majorEastAsia" w:cstheme="majorBidi"/>
+      <w:rFonts w:asciiTheme="majorHAnsi" w:eastAsiaTheme="majorEastAsia" w:hAnsiTheme="majorHAnsi" w:cstheme="majorBidi"/>
       <w:color w:val="0F4761" w:themeColor="accent1" w:themeShade="BF"/>
       <w:sz w:val="40"/>
       <w:szCs w:val="40"/>
     </w:rPr>
   </w:style>
-  <w:style w:type="character" w:styleId="Titre2Car" w:customStyle="1">
+  <w:style w:type="character" w:customStyle="1" w:styleId="Titre2Car">
     <w:name w:val="Titre 2 Car"/>
     <w:basedOn w:val="Policepardfaut"/>
     <w:link w:val="Titre2"/>
@@ -1553,13 +1313,13 @@
     <w:semiHidden/>
     <w:rsid w:val="006350F7"/>
     <w:rPr>
-      <w:rFonts w:asciiTheme="majorHAnsi" w:hAnsiTheme="majorHAnsi" w:eastAsiaTheme="majorEastAsia" w:cstheme="majorBidi"/>
+      <w:rFonts w:asciiTheme="majorHAnsi" w:eastAsiaTheme="majorEastAsia" w:hAnsiTheme="majorHAnsi" w:cstheme="majorBidi"/>
       <w:color w:val="0F4761" w:themeColor="accent1" w:themeShade="BF"/>
       <w:sz w:val="32"/>
       <w:szCs w:val="32"/>
     </w:rPr>
   </w:style>
-  <w:style w:type="character" w:styleId="Titre3Car" w:customStyle="1">
+  <w:style w:type="character" w:customStyle="1" w:styleId="Titre3Car">
     <w:name w:val="Titre 3 Car"/>
     <w:basedOn w:val="Policepardfaut"/>
     <w:link w:val="Titre3"/>
@@ -1573,7 +1333,7 @@
       <w:szCs w:val="28"/>
     </w:rPr>
   </w:style>
-  <w:style w:type="character" w:styleId="Titre4Car" w:customStyle="1">
+  <w:style w:type="character" w:customStyle="1" w:styleId="Titre4Car">
     <w:name w:val="Titre 4 Car"/>
     <w:basedOn w:val="Policepardfaut"/>
     <w:link w:val="Titre4"/>
@@ -1587,7 +1347,7 @@
       <w:color w:val="0F4761" w:themeColor="accent1" w:themeShade="BF"/>
     </w:rPr>
   </w:style>
-  <w:style w:type="character" w:styleId="Titre5Car" w:customStyle="1">
+  <w:style w:type="character" w:customStyle="1" w:styleId="Titre5Car">
     <w:name w:val="Titre 5 Car"/>
     <w:basedOn w:val="Policepardfaut"/>
     <w:link w:val="Titre5"/>
@@ -1599,7 +1359,7 @@
       <w:color w:val="0F4761" w:themeColor="accent1" w:themeShade="BF"/>
     </w:rPr>
   </w:style>
-  <w:style w:type="character" w:styleId="Titre6Car" w:customStyle="1">
+  <w:style w:type="character" w:customStyle="1" w:styleId="Titre6Car">
     <w:name w:val="Titre 6 Car"/>
     <w:basedOn w:val="Policepardfaut"/>
     <w:link w:val="Titre6"/>
@@ -1613,7 +1373,7 @@
       <w:color w:val="595959" w:themeColor="text1" w:themeTint="A6"/>
     </w:rPr>
   </w:style>
-  <w:style w:type="character" w:styleId="Titre7Car" w:customStyle="1">
+  <w:style w:type="character" w:customStyle="1" w:styleId="Titre7Car">
     <w:name w:val="Titre 7 Car"/>
     <w:basedOn w:val="Policepardfaut"/>
     <w:link w:val="Titre7"/>
@@ -1625,7 +1385,7 @@
       <w:color w:val="595959" w:themeColor="text1" w:themeTint="A6"/>
     </w:rPr>
   </w:style>
-  <w:style w:type="character" w:styleId="Titre8Car" w:customStyle="1">
+  <w:style w:type="character" w:customStyle="1" w:styleId="Titre8Car">
     <w:name w:val="Titre 8 Car"/>
     <w:basedOn w:val="Policepardfaut"/>
     <w:link w:val="Titre8"/>
@@ -1639,7 +1399,7 @@
       <w:color w:val="272727" w:themeColor="text1" w:themeTint="D8"/>
     </w:rPr>
   </w:style>
-  <w:style w:type="character" w:styleId="Titre9Car" w:customStyle="1">
+  <w:style w:type="character" w:customStyle="1" w:styleId="Titre9Car">
     <w:name w:val="Titre 9 Car"/>
     <w:basedOn w:val="Policepardfaut"/>
     <w:link w:val="Titre9"/>
@@ -1664,21 +1424,21 @@
       <w:contextualSpacing/>
     </w:pPr>
     <w:rPr>
-      <w:rFonts w:asciiTheme="majorHAnsi" w:hAnsiTheme="majorHAnsi" w:eastAsiaTheme="majorEastAsia" w:cstheme="majorBidi"/>
+      <w:rFonts w:asciiTheme="majorHAnsi" w:eastAsiaTheme="majorEastAsia" w:hAnsiTheme="majorHAnsi" w:cstheme="majorBidi"/>
       <w:spacing w:val="-10"/>
       <w:kern w:val="28"/>
       <w:sz w:val="56"/>
       <w:szCs w:val="56"/>
     </w:rPr>
   </w:style>
-  <w:style w:type="character" w:styleId="TitreCar" w:customStyle="1">
+  <w:style w:type="character" w:customStyle="1" w:styleId="TitreCar">
     <w:name w:val="Titre Car"/>
     <w:basedOn w:val="Policepardfaut"/>
     <w:link w:val="Titre"/>
     <w:uiPriority w:val="10"/>
     <w:rsid w:val="006350F7"/>
     <w:rPr>
-      <w:rFonts w:asciiTheme="majorHAnsi" w:hAnsiTheme="majorHAnsi" w:eastAsiaTheme="majorEastAsia" w:cstheme="majorBidi"/>
+      <w:rFonts w:asciiTheme="majorHAnsi" w:eastAsiaTheme="majorEastAsia" w:hAnsiTheme="majorHAnsi" w:cstheme="majorBidi"/>
       <w:spacing w:val="-10"/>
       <w:kern w:val="28"/>
       <w:sz w:val="56"/>
@@ -1706,7 +1466,7 @@
       <w:szCs w:val="28"/>
     </w:rPr>
   </w:style>
-  <w:style w:type="character" w:styleId="Sous-titreCar" w:customStyle="1">
+  <w:style w:type="character" w:customStyle="1" w:styleId="Sous-titreCar">
     <w:name w:val="Sous-titre Car"/>
     <w:basedOn w:val="Policepardfaut"/>
     <w:link w:val="Sous-titre"/>
@@ -1738,7 +1498,7 @@
       <w:color w:val="404040" w:themeColor="text1" w:themeTint="BF"/>
     </w:rPr>
   </w:style>
-  <w:style w:type="character" w:styleId="CitationCar" w:customStyle="1">
+  <w:style w:type="character" w:customStyle="1" w:styleId="CitationCar">
     <w:name w:val="Citation Car"/>
     <w:basedOn w:val="Policepardfaut"/>
     <w:link w:val="Citation"/>
@@ -1783,8 +1543,8 @@
     <w:rsid w:val="006350F7"/>
     <w:pPr>
       <w:pBdr>
-        <w:top w:val="single" w:color="0F4761" w:themeColor="accent1" w:themeShade="BF" w:sz="4" w:space="10"/>
-        <w:bottom w:val="single" w:color="0F4761" w:themeColor="accent1" w:themeShade="BF" w:sz="4" w:space="10"/>
+        <w:top w:val="single" w:sz="4" w:space="10" w:color="0F4761" w:themeColor="accent1" w:themeShade="BF"/>
+        <w:bottom w:val="single" w:sz="4" w:space="10" w:color="0F4761" w:themeColor="accent1" w:themeShade="BF"/>
       </w:pBdr>
       <w:spacing w:before="360" w:after="360"/>
       <w:ind w:left="864" w:right="864"/>
@@ -1796,7 +1556,7 @@
       <w:color w:val="0F4761" w:themeColor="accent1" w:themeShade="BF"/>
     </w:rPr>
   </w:style>
-  <w:style w:type="character" w:styleId="CitationintenseCar" w:customStyle="1">
+  <w:style w:type="character" w:customStyle="1" w:styleId="CitationintenseCar">
     <w:name w:val="Citation intense Car"/>
     <w:basedOn w:val="Policepardfaut"/>
     <w:link w:val="Citationintense"/>
@@ -1849,7 +1609,7 @@
 </file>
 
 <file path=word/theme/theme1.xml><?xml version="1.0" encoding="utf-8"?>
-<a:theme xmlns:a="http://schemas.openxmlformats.org/drawingml/2006/main" xmlns:thm15="http://schemas.microsoft.com/office/thememl/2012/main" name="Thème Office">
+<a:theme xmlns:a="http://schemas.openxmlformats.org/drawingml/2006/main" name="Thème Office">
   <a:themeElements>
     <a:clrScheme name="Office">
       <a:dk1>
@@ -2164,6 +1924,26 @@
 </file>
 
 <file path=customXml/item1.xml><?xml version="1.0" encoding="utf-8"?>
+<p:properties xmlns:p="http://schemas.microsoft.com/office/2006/metadata/properties" xmlns:xsi="http://www.w3.org/2001/XMLSchema-instance" xmlns:pc="http://schemas.microsoft.com/office/infopath/2007/PartnerControls">
+  <documentManagement>
+    <TaxCatchAll xmlns="9877842e-127a-4c45-b612-0f554330d3bc" xsi:nil="true"/>
+    <lcf76f155ced4ddcb4097134ff3c332f xmlns="79be6eb5-5a93-495e-80bf-d6e3ad465d9e">
+      <Terms xmlns="http://schemas.microsoft.com/office/infopath/2007/PartnerControls"/>
+    </lcf76f155ced4ddcb4097134ff3c332f>
+  </documentManagement>
+</p:properties>
+</file>
+
+<file path=customXml/item2.xml><?xml version="1.0" encoding="utf-8"?>
+<?mso-contentType ?>
+<FormTemplates xmlns="http://schemas.microsoft.com/sharepoint/v3/contenttype/forms">
+  <Display>DocumentLibraryForm</Display>
+  <Edit>DocumentLibraryForm</Edit>
+  <New>DocumentLibraryForm</New>
+</FormTemplates>
+</file>
+
+<file path=customXml/item3.xml><?xml version="1.0" encoding="utf-8"?>
 <ct:contentTypeSchema xmlns:ct="http://schemas.microsoft.com/office/2006/metadata/contentType" xmlns:ma="http://schemas.microsoft.com/office/2006/metadata/properties/metaAttributes" ct:_="" ma:_="" ma:contentTypeName="Document" ma:contentTypeID="0x01010064C73B34D65C1844A76173BFFDF5F29C" ma:contentTypeVersion="10" ma:contentTypeDescription="Crée un document." ma:contentTypeScope="" ma:versionID="43f318cc1b0c932456edb5e70710d43f">
   <xsd:schema xmlns:xsd="http://www.w3.org/2001/XMLSchema" xmlns:xs="http://www.w3.org/2001/XMLSchema" xmlns:p="http://schemas.microsoft.com/office/2006/metadata/properties" xmlns:ns2="79be6eb5-5a93-495e-80bf-d6e3ad465d9e" xmlns:ns3="9877842e-127a-4c45-b612-0f554330d3bc" targetNamespace="http://schemas.microsoft.com/office/2006/metadata/properties" ma:root="true" ma:fieldsID="6ebcb77da8284891b0b46c903f9a775f" ns2:_="" ns3:_="">
     <xsd:import namespace="79be6eb5-5a93-495e-80bf-d6e3ad465d9e"/>
@@ -2352,34 +2132,40 @@
 </ct:contentTypeSchema>
 </file>
 
-<file path=customXml/item2.xml><?xml version="1.0" encoding="utf-8"?>
-<?mso-contentType ?>
-<FormTemplates xmlns="http://schemas.microsoft.com/sharepoint/v3/contenttype/forms">
-  <Display>DocumentLibraryForm</Display>
-  <Edit>DocumentLibraryForm</Edit>
-  <New>DocumentLibraryForm</New>
-</FormTemplates>
-</file>
-
-<file path=customXml/item3.xml><?xml version="1.0" encoding="utf-8"?>
-<p:properties xmlns:p="http://schemas.microsoft.com/office/2006/metadata/properties" xmlns:xsi="http://www.w3.org/2001/XMLSchema-instance" xmlns:pc="http://schemas.microsoft.com/office/infopath/2007/PartnerControls">
-  <documentManagement>
-    <TaxCatchAll xmlns="9877842e-127a-4c45-b612-0f554330d3bc" xsi:nil="true"/>
-    <lcf76f155ced4ddcb4097134ff3c332f xmlns="79be6eb5-5a93-495e-80bf-d6e3ad465d9e">
-      <Terms xmlns="http://schemas.microsoft.com/office/infopath/2007/PartnerControls"/>
-    </lcf76f155ced4ddcb4097134ff3c332f>
-  </documentManagement>
-</p:properties>
-</file>
-
 <file path=customXml/itemProps1.xml><?xml version="1.0" encoding="utf-8"?>
-<ds:datastoreItem xmlns:ds="http://schemas.openxmlformats.org/officeDocument/2006/customXml" ds:itemID="{F14DAF9B-F28F-452A-9E12-0ECE08788FD9}"/>
+<ds:datastoreItem xmlns:ds="http://schemas.openxmlformats.org/officeDocument/2006/customXml" ds:itemID="{1EB1BED8-5082-4055-83F4-9BAC38F2D541}">
+  <ds:schemaRefs>
+    <ds:schemaRef ds:uri="http://schemas.microsoft.com/office/2006/metadata/properties"/>
+    <ds:schemaRef ds:uri="http://schemas.microsoft.com/office/infopath/2007/PartnerControls"/>
+    <ds:schemaRef ds:uri="9877842e-127a-4c45-b612-0f554330d3bc"/>
+    <ds:schemaRef ds:uri="79be6eb5-5a93-495e-80bf-d6e3ad465d9e"/>
+  </ds:schemaRefs>
+</ds:datastoreItem>
 </file>
 
 <file path=customXml/itemProps2.xml><?xml version="1.0" encoding="utf-8"?>
-<ds:datastoreItem xmlns:ds="http://schemas.openxmlformats.org/officeDocument/2006/customXml" ds:itemID="{AE72D41F-2D23-49F0-AF87-2126E6ED39DE}"/>
+<ds:datastoreItem xmlns:ds="http://schemas.openxmlformats.org/officeDocument/2006/customXml" ds:itemID="{AE72D41F-2D23-49F0-AF87-2126E6ED39DE}">
+  <ds:schemaRefs>
+    <ds:schemaRef ds:uri="http://schemas.microsoft.com/sharepoint/v3/contenttype/forms"/>
+  </ds:schemaRefs>
+</ds:datastoreItem>
 </file>
 
 <file path=customXml/itemProps3.xml><?xml version="1.0" encoding="utf-8"?>
-<ds:datastoreItem xmlns:ds="http://schemas.openxmlformats.org/officeDocument/2006/customXml" ds:itemID="{1EB1BED8-5082-4055-83F4-9BAC38F2D541}"/>
+<ds:datastoreItem xmlns:ds="http://schemas.openxmlformats.org/officeDocument/2006/customXml" ds:itemID="{F14DAF9B-F28F-452A-9E12-0ECE08788FD9}">
+  <ds:schemaRefs>
+    <ds:schemaRef ds:uri="http://schemas.microsoft.com/office/2006/metadata/contentType"/>
+    <ds:schemaRef ds:uri="http://schemas.microsoft.com/office/2006/metadata/properties/metaAttributes"/>
+    <ds:schemaRef ds:uri="http://www.w3.org/2001/XMLSchema"/>
+    <ds:schemaRef ds:uri="http://schemas.microsoft.com/office/2006/metadata/properties"/>
+    <ds:schemaRef ds:uri="79be6eb5-5a93-495e-80bf-d6e3ad465d9e"/>
+    <ds:schemaRef ds:uri="9877842e-127a-4c45-b612-0f554330d3bc"/>
+    <ds:schemaRef ds:uri="http://schemas.microsoft.com/office/2006/documentManagement/types"/>
+    <ds:schemaRef ds:uri="http://schemas.microsoft.com/office/infopath/2007/PartnerControls"/>
+    <ds:schemaRef ds:uri="http://schemas.openxmlformats.org/package/2006/metadata/core-properties"/>
+    <ds:schemaRef ds:uri="http://purl.org/dc/elements/1.1/"/>
+    <ds:schemaRef ds:uri="http://purl.org/dc/terms/"/>
+    <ds:schemaRef ds:uri="http://schemas.microsoft.com/internal/obd"/>
+  </ds:schemaRefs>
+</ds:datastoreItem>
 </file>
</xml_diff>